<commit_message>
docs: add Phase 04 (Gateway-routed tools & AgentCore Memory) to the report and deck
Word report: new Section 15 (objective, what each capability does, key
engineering decisions, issues found and fixed, live verification results,
business value), plus consistency updates everywhere the report previously
described Gateway/Memory as unbuilt placeholders (cover table, roadmap,
architecture table, advantages, glossary, conclusion).

Slide deck (renamed to include Phase 04): a new dedicated Phase 04 slide,
the title slide's phase badges, the cloud-architecture slide's Gateway/
Memory boxes, and the four-phase delivery-journey slide (previously only
showed three phases). The Current Status slide's Gateway/Memory row now
sits right after Phase 03 with a green "live-verified" pill instead of
grey "not yet wired in", and Staging/Production rollout moved to last.

Co-Authored-By: Claude Sonnet 5 <noreply@anthropic.com>
</commit_message>
<xml_diff>
--- a/docs/AMC_RFP_Orchestrator_Project_Report.docx
+++ b/docs/AMC_RFP_Orchestrator_Project_Report.docx
@@ -175,7 +175,7 @@
               <w:rPr>
                 <w:sz w:val="21"/>
               </w:rPr>
-              <w:t>Phase 01 (Development), Phase 02 (Cloud Deployment) &amp; Phase 03 (CI/CD Automation)</w:t>
+              <w:t>Phase 01 (Development), Phase 02 (Cloud Deployment), Phase 03 (CI/CD Automation) &amp; Phase 04 (Gateway-Routed Tools &amp; AgentCore Memory)</w:t>
             </w:r>
           </w:p>
         </w:tc>
@@ -207,7 +207,7 @@
               <w:rPr>
                 <w:sz w:val="21"/>
               </w:rPr>
-              <w:t>Phase 01 complete; Phase 02 and Phase 03 both proven end-to-end on real AWS for the Development environment; Staging/Production rollout pending</w:t>
+              <w:t>Phase 01 complete; Phases 02–04 all proven end-to-end on real AWS for the Development environment; Staging/Production rollout pending</w:t>
             </w:r>
           </w:p>
         </w:tc>
@@ -8250,6 +8250,14 @@
         <w:pStyle w:val="ListBullet"/>
       </w:pPr>
       <w:r>
+        <w:t>Governed tool reuse and conversational continuity — data-retrieval tools can be exposed through a single AWS-governed access point for reuse by other systems or agents, and the system can carry context across a client’s follow-up questions within a session, without weakening any of the compliance guarantees above (Section 15).</w:t>
+      </w:r>
+    </w:p>
+    <w:p>
+      <w:pPr>
+        <w:pStyle w:val="ListBullet"/>
+      </w:pPr>
+      <w:r>
         <w:rPr>
           <w:b/>
         </w:rPr>
@@ -8774,7 +8782,7 @@
         <w:pStyle w:val="ListBullet"/>
       </w:pPr>
       <w:r>
-        <w:t>Implement real tool logic behind the AgentCore Gateway targets and wire AgentCore Memory into the graph for cross-turn conversational context — both currently provisioned but placeholder/unused.</w:t>
+        <w:t>Gateway-routed tool logic and AgentCore Memory are now implemented and live-verified end-to-end against real AWS (Section 15); the remaining step is carrying both through Staging and Production once each environment has its first deployment, and adding the Memory round-trip to the project’s automated integration-test suite alongside the manual verification already performed.</w:t>
       </w:r>
     </w:p>
     <w:p>
@@ -8798,6 +8806,20 @@
     </w:p>
     <w:p>
       <w:pPr/>
+    </w:p>
+    <w:p>
+      <w:pPr>
+        <w:pStyle w:val="Heading2"/>
+      </w:pPr>
+      <w:r>
+        <w:t>12.6 Phase 04 (Gateway-Routed Tools &amp; AgentCore Memory) — Live-Verified on Real AWS</w:t>
+      </w:r>
+    </w:p>
+    <w:p>
+      <w:pPr/>
+      <w:r>
+        <w:t>The previously deferred Gateway-routed tool logic and AgentCore Memory integration (Section 13.8) have been implemented and live-verified end-to-end against real AWS — see Section 15 for the full account, including engineering decisions, issues found and fixed during live deployment, and live verification results for both capabilities.</w:t>
+      </w:r>
     </w:p>
     <w:p>
       <w:pPr>
@@ -9055,7 +9077,7 @@
           </w:tcPr>
           <w:p>
             <w:r>
-              <w:t>Tool exposure (provisioned, not yet wired in)</w:t>
+              <w:t>Tool exposure (real tool logic since Phase 04, Section 15)</w:t>
             </w:r>
           </w:p>
         </w:tc>
@@ -9077,7 +9099,7 @@
           </w:tcPr>
           <w:p>
             <w:r>
-              <w:t>Conversation memory (provisioned, not yet wired in)</w:t>
+              <w:t>Conversation memory (real cross-turn read/write since Phase 04, Section 15)</w:t>
             </w:r>
           </w:p>
         </w:tc>
@@ -9529,8 +9551,7 @@
         <w:pStyle w:val="ListBullet"/>
       </w:pPr>
       <w:r>
-        <w:lastRenderedPageBreak/>
-        <w:t>AgentCore Gateway-routed tool logic and AgentCore Memory (cross-turn conversational context): both provisioned by Terraform but intentionally left as a separate, larger follow-on rather than bundled into this phase.</w:t>
+        <w:t>AgentCore Gateway-routed tool logic and AgentCore Memory (cross-turn conversational context): both were intentionally left as a separate, larger follow-on rather than bundled into this phase — that follow-on is now complete and live-verified against real AWS; see Section 15 for the full account.</w:t>
       </w:r>
     </w:p>
     <w:p>
@@ -9985,17 +10006,293 @@
       <w:pPr>
         <w:pStyle w:val="Heading1"/>
       </w:pPr>
+      <w:r>
+        <w:t>15. Phase 04: Gateway-Routed Tools &amp; AgentCore Memory</w:t>
+      </w:r>
+    </w:p>
+    <w:p>
+      <w:pPr/>
+      <w:r>
+        <w:t>Phase 02 provisioned two AWS capabilities that were deliberately left unused at the time — a governed, centrally managed way to expose the system’s data-retrieval tools (AgentCore Gateway), and a managed service for retaining conversation history across a client’s questions (AgentCore Memory) — flagged in Section 13.8 as a separate, larger follow-on rather than bundled into that phase. Phase 04 completes that follow-on: real tool logic behind the Gateway, and a working read/write integration with AgentCore Memory for cross-turn conversational context, both implemented and live-verified end-to-end against real AWS.</w:t>
+      </w:r>
+    </w:p>
+    <w:p>
+      <w:pPr>
+        <w:pStyle w:val="Heading2"/>
+      </w:pPr>
+      <w:r>
+        <w:t>15.1 Objective and Scope</w:t>
+      </w:r>
+    </w:p>
+    <w:p>
+      <w:pPr/>
+      <w:r>
+        <w:t>The objective was to turn two previously provisioned-but-inert AWS capabilities into real, working functionality, without altering the behaviour, compliance guarantees, or output of the five core agents in any way. Both capabilities were built as strictly additive and independently switchable: enabling either one is a configuration choice, not a code change, and the system’s existing direct-access, single-turn behaviour remains fully available and unaffected when neither is switched on.</w:t>
+      </w:r>
+    </w:p>
+    <w:p>
+      <w:pPr>
+        <w:pStyle w:val="Heading2"/>
+      </w:pPr>
+      <w:r>
+        <w:t>15.2 AgentCore Gateway-Routed Tools</w:t>
+      </w:r>
+    </w:p>
+    <w:p>
+      <w:pPr/>
+      <w:r>
+        <w:t>The system’s two data-retrieval tools — the quantitative fund-metrics lookup and the qualitative commentary search described in Section 5.1 — can now optionally be routed through AWS’s governed Gateway service instead of being called directly from within the application process. The Gateway forwards each tool call, over an authenticated connection, to a small piece of serverless compute that performs the identical governed data lookup the direct path already used, and returns the result back to the requesting agent.</w:t>
+      </w:r>
+    </w:p>
+    <w:p>
+      <w:pPr>
+        <w:pStyle w:val="ListBullet"/>
+      </w:pPr>
+      <w:r>
+        <w:t>Centralised governance and reuse. Because the underlying tool logic now lives behind a single AWS-managed access point rather than only inside this application, the same governed data-retrieval capability becomes directly reusable by other systems or future agents (for example, a portfolio-rebalancing analyst or an ESG-commentary agent envisioned in Section 12.4) without re-implementing data access from scratch.</w:t>
+      </w:r>
+    </w:p>
+    <w:p>
+      <w:pPr>
+        <w:pStyle w:val="ListBullet"/>
+      </w:pPr>
+      <w:r>
+        <w:t>No change to what the agents see or how they behave. Whether a tool call is served directly or routed through the Gateway, the agent receives the identical result in the identical format — this is purely an infrastructure and governance choice, invisible to the compliance loop and the final report.</w:t>
+      </w:r>
+    </w:p>
+    <w:p>
+      <w:pPr>
+        <w:pStyle w:val="ListBullet"/>
+      </w:pPr>
+      <w:r>
+        <w:t>Opt-in, not required. The direct-access path used throughout Phases 01–03 remains the default; Gateway routing is switched on by configuration where the added governance and reusability are wanted.</w:t>
+      </w:r>
+    </w:p>
+    <w:p>
+      <w:pPr>
+        <w:pStyle w:val="Heading2"/>
+      </w:pPr>
+      <w:r>
+        <w:t>15.3 AgentCore Memory (Cross-Turn Conversational Context)</w:t>
+      </w:r>
+    </w:p>
+    <w:p>
+      <w:pPr/>
+      <w:r>
+        <w:t>The system can now optionally retain a working memory of a client’s earlier questions within the same conversation, and bring that context into how it answers a later, related question — for example, correctly understanding a follow-up question about a fund’s risk profile as still referring to the fund named two questions earlier, without the client or relationship manager needing to restate it. This is a materially more natural interaction pattern than the single-shot, stateless question-and-answer behaviour the system has had since Phase 01, and directly strengthens the client-portal integration already identified as a roadmap priority in Section 12.4.</w:t>
+      </w:r>
+    </w:p>
+    <w:p>
+      <w:pPr>
+        <w:pStyle w:val="ListBullet"/>
+      </w:pPr>
+      <w:r>
+        <w:t>Every earlier turn in the conversation is available as context for the current question, retrieved from a managed AWS service purpose-built for this, rather than the application needing to store and manage conversation state itself.</w:t>
+      </w:r>
+    </w:p>
+    <w:p>
+      <w:pPr>
+        <w:pStyle w:val="ListBullet"/>
+      </w:pPr>
+      <w:r>
+        <w:t>Compliance is never affected. Memory only supplies conversational context to help the system understand what a question is actually asking — every response, regardless of what came before it in the conversation, is still independently synthesised, checked against the full compliance rubric, and subject to the same self-correction and escalation guarantees described in Section 5.2.</w:t>
+      </w:r>
+    </w:p>
+    <w:p>
+      <w:pPr>
+        <w:pStyle w:val="ListBullet"/>
+      </w:pPr>
+      <w:r>
+        <w:t>Fails safely and silently toward the existing behaviour. If the memory service is ever unavailable or a lookup fails for any reason, the system logs the failure and proceeds exactly as it would with memory switched off, rather than allowing a memory-layer problem to disrupt or degrade the client-facing response.</w:t>
+      </w:r>
+    </w:p>
+    <w:p>
+      <w:pPr>
+        <w:pStyle w:val="Heading2"/>
+      </w:pPr>
+      <w:r>
+        <w:t>15.4 Key Engineering Decisions</w:t>
+      </w:r>
+    </w:p>
+    <w:p>
+      <w:pPr/>
+      <w:r>
+        <w:t>Two decisions were made deliberately during implementation, each confirmed by direct testing rather than assumed from documentation:</w:t>
+      </w:r>
+    </w:p>
+    <w:p>
+      <w:pPr>
+        <w:pStyle w:val="ListBullet"/>
+      </w:pPr>
+      <w:r>
+        <w:t>Conversational continuity is implemented around the agent workflow, not as a built-in framework feature. The underlying Strands Agents framework’s own native session-memory capability does not currently support the multi-agent graph pattern this system is built on — confirmed by direct testing, not assumed. The chosen approach achieves the identical business outcome, a later question benefiting from an earlier one’s context, at the orchestration layer instead, with no change to how the graph itself, or its compliance guarantees, behave.</w:t>
+      </w:r>
+    </w:p>
+    <w:p>
+      <w:pPr>
+        <w:pStyle w:val="ListBullet"/>
+      </w:pPr>
+      <w:r>
+        <w:t>The Development environment’s deployed service runs with conversational memory switched on by default, unlike the Gateway routing above, which remains opt-in everywhere including in Development. This was a deliberate choice so the underlying AWS permission the deployed service needs for memory access is continuously exercised under the exact, narrowly-scoped identity the service actually runs as in production-like conditions — not just verified once under a developer’s own broad account access, which would not have reliably caught a real permission gap.</w:t>
+      </w:r>
+    </w:p>
+    <w:p>
+      <w:pPr>
+        <w:pStyle w:val="ListBullet"/>
+      </w:pPr>
+      <w:r>
+        <w:t>Both capabilities’ AWS permissions were scoped to the minimum access each specific function needs, following the same least-privilege discipline already established for every other AWS identity in this system (Sections 13.3 and 14.4).</w:t>
+      </w:r>
+    </w:p>
+    <w:p>
+      <w:pPr>
+        <w:pStyle w:val="Heading2"/>
+      </w:pPr>
+      <w:r>
+        <w:t>15.5 Real Issues Found and Fixed During Live Deployment</w:t>
+      </w:r>
+    </w:p>
+    <w:p>
+      <w:pPr/>
+      <w:r>
+        <w:t>Consistent with the reliability-engineering discipline described in Sections 7.4, 13.4, and 14.5, neither capability was considered complete on a successful build or a passing structural check alone — both were proven by actually exercising them against real AWS, and each surfaced a genuine issue invisible to any offline test:</w:t>
+      </w:r>
+    </w:p>
+    <w:p>
+      <w:pPr>
+        <w:pStyle w:val="ListBullet"/>
+      </w:pPr>
+      <w:r>
+        <w:t>An undocumented AWS platform behaviour around how the Gateway names the tools it exposes caused the agents to silently receive no usable tools at all when Gateway routing was first switched on — not an error, but a model producing a plausible-looking answer without actually retrieving any real data, exactly the failure mode this project’s verification discipline exists to catch. Found only by inspecting what the Gateway actually advertised, not from any documentation, and fixed by accounting for the platform’s real naming behaviour.</w:t>
+      </w:r>
+    </w:p>
+    <w:p>
+      <w:pPr>
+        <w:pStyle w:val="ListBullet"/>
+      </w:pPr>
+      <w:r>
+        <w:t>Two further instances of a pattern already seen twice before in this project (Sections 13.4 and 14.5): a specific AWS permission name assumed from available documentation turned out to be incorrect, caught only by a real access-denied response from a live call, and corrected against AWS’s own authoritative reference rather than a second guess.</w:t>
+      </w:r>
+    </w:p>
+    <w:p>
+      <w:pPr>
+        <w:pStyle w:val="ListBullet"/>
+      </w:pPr>
+      <w:r>
+        <w:t>Both fixes were confirmed resolved by a subsequent real AWS call, not merely a passing automated test — the same evidentiary standard applied throughout this project’s cloud-deployment work.</w:t>
+      </w:r>
+    </w:p>
+    <w:p>
+      <w:pPr>
+        <w:pStyle w:val="Heading2"/>
+      </w:pPr>
+      <w:r>
+        <w:t>15.6 Live Verification Results</w:t>
+      </w:r>
+    </w:p>
+    <w:p>
+      <w:pPr/>
+      <w:r>
+        <w:t>Gateway-routed tools: a real query executed with tool calls routed through the Gateway returned the identical, correct quantitative and qualitative content as the direct-access path, and the underlying compute logs confirmed the actual serverless tool logic was genuinely invoked at the exact moment of the query — not a good-looking answer that silently fell back to the direct path unnoticed.</w:t>
+      </w:r>
+    </w:p>
+    <w:p>
+      <w:pPr/>
+      <w:r>
+        <w:t>AgentCore Memory: two real questions were submitted to the deployed Runtime within the same conversation. The second question deliberately did not name the fund being asked about, referring to it only as “that fund” — and the system correctly understood which fund was meant from the first question, returning an accurate follow-on comparison. This was independently confirmed a second way: querying the memory service directly afterward showed both questions and answers genuinely stored against the correct conversation, not just a favourable coincidence of the model’s own reasoning.</w:t>
+      </w:r>
+    </w:p>
+    <w:p>
+      <w:pPr>
+        <w:pStyle w:val="Heading2"/>
+      </w:pPr>
+      <w:r>
+        <w:t>15.7 Business Value and Practical Benefits</w:t>
+      </w:r>
+    </w:p>
+    <w:p>
+      <w:pPr/>
+      <w:r>
+        <w:t>Both capabilities extend the system’s value beyond faster individual responses (Section 9) toward a more natural, more reusable, and more governable overall platform:</w:t>
+      </w:r>
+    </w:p>
+    <w:p>
+      <w:pPr>
+        <w:pStyle w:val="ListBullet"/>
+      </w:pPr>
+      <w:r>
+        <w:t>A materially more natural client interaction. Relationship managers and clients can ask a genuine follow-up question the way they naturally would in conversation, rather than needing to restate full context on every question — directly strengthening the case for integrating this system into a real, conversational client-portal experience (Section 12.4).</w:t>
+      </w:r>
+    </w:p>
+    <w:p>
+      <w:pPr>
+        <w:pStyle w:val="ListBullet"/>
+      </w:pPr>
+      <w:r>
+        <w:t>A reusable, centrally governed data-access layer. Once tool access runs through the Gateway, the same governed quantitative and qualitative retrieval capability is available to other systems and future agents without re-implementing it, turning a single-purpose integration into shared, platform-level infrastructure.</w:t>
+      </w:r>
+    </w:p>
+    <w:p>
+      <w:pPr>
+        <w:pStyle w:val="ListBullet"/>
+      </w:pPr>
+      <w:r>
+        <w:t>Zero added compliance risk. Both capabilities were designed so that conversational convenience and infrastructure reuse never come at the expense of the compliance guarantees established in Sections 5.2 and 10 — every response is still independently grounded, checked, and, if necessary, escalated exactly as before.</w:t>
+      </w:r>
+    </w:p>
+    <w:p>
+      <w:pPr>
+        <w:pStyle w:val="Heading2"/>
+      </w:pPr>
+      <w:r>
+        <w:t>15.8 Current Status and Remaining Work</w:t>
+      </w:r>
+    </w:p>
+    <w:p>
+      <w:pPr/>
+      <w:r>
+        <w:t>As of this report, Phase 04 stands as follows:</w:t>
+      </w:r>
+    </w:p>
+    <w:p>
+      <w:pPr>
+        <w:pStyle w:val="ListBullet"/>
+      </w:pPr>
+      <w:r>
+        <w:t>Both capabilities are implemented and live-verified end-to-end against real AWS for the Development environment, using the same direct-evidence standard applied throughout Phases 02 and 03.</w:t>
+      </w:r>
+    </w:p>
+    <w:p>
+      <w:pPr>
+        <w:pStyle w:val="ListBullet"/>
+      </w:pPr>
+      <w:r>
+        <w:t>Both remain opt-in by configuration; carrying them through to Staging and Production is part of the same first-deployment rollout already recommended for those environments in Section 12.4.</w:t>
+      </w:r>
+    </w:p>
+    <w:p>
+      <w:pPr>
+        <w:pStyle w:val="ListBullet"/>
+      </w:pPr>
+      <w:r>
+        <w:t>The conversational-memory round-trip has so far been verified through a targeted, one-off verification exercise rather than the project’s automated, repeatable test suite used elsewhere (Section 7.5) — adding equivalent automated coverage is a recommended near-term addition.</w:t>
+      </w:r>
+    </w:p>
+    <w:p>
+      <w:pPr>
+        <w:pStyle w:val="Heading1"/>
+      </w:pPr>
       <w:bookmarkStart w:id="103" w:name="_Toc234670606"/>
       <w:bookmarkStart w:id="104" w:name="_Toc234826391"/>
       <w:r>
-        <w:t>15. Conclusion</w:t>
+        <w:t>16. Conclusion</w:t>
       </w:r>
       <w:bookmarkEnd w:id="103"/>
       <w:bookmarkEnd w:id="104"/>
     </w:p>
     <w:p>
       <w:r>
-        <w:t>The AMC RFP &amp; Portfolio Insight Orchestrator demonstrates that agentic AI, applied with the same discipline as any other production financial-services system, can automate one of an AMC's most labour-intensive and compliance-sensitive workflows without compromising on governance. By decomposing the work across specialised agents, grounding every figure in real data, and making compliance a structural, self-correcting property of the workflow rather than a manual checklist, the system delivers response times measured in seconds instead of days, while producing a stronger, more consistent, and more auditable compliance trail than the manual process it replaces. Built on AWS's Strands Agents framework and designed from day one for a clean path to AWS Bedrock in production, this system has since been proven not only in local development but as a real, deployed AWS service: Phase 02 stood up the full Amazon Bedrock AgentCore infrastructure and live-verified every mock fund scenario end-to-end in the cloud, with zero changes to the underlying agent logic, and Phase 03 codified the build-and-deploy process itself into an automated, auditable pipeline that requires no long-lived cloud credentials. What remains is publishing the project to its source-control platform, the short one-time setup that pipeline depends on, promotion to Staging and Production, and the deferred Gateway/Memory integration work described in Section 13.8 — not a redesign, but a continuation of a foundation already proven to work.</w:t>
+        <w:t>The AMC RFP &amp; Portfolio Insight Orchestrator demonstrates that agentic AI, applied with the same discipline as any other production financial-services system, can automate one of an AMC’s most labour-intensive and compliance-sensitive workflows without compromising on governance. By decomposing the work across specialised agents, grounding every figure in real data, and making compliance a structural, self-correcting property of the workflow rather than a manual checklist, the system delivers response times measured in seconds instead of days, while producing a stronger, more consistent, and more auditable compliance trail than the manual process it replaces. Built on AWS’s Strands Agents framework and designed from day one for a clean path to AWS Bedrock in production, this system has since been proven not only in local development but as a real, deployed AWS service: Phase 02 stood up the full Amazon Bedrock AgentCore infrastructure and live-verified every mock fund scenario end-to-end in the cloud, with zero changes to the underlying agent logic, and Phase 03 codified the build-and-deploy process itself into an automated, auditable pipeline that requires no long-lived cloud credentials. Phase 04 has since implemented and live-verified the previously deferred Gateway-routed tool logic and AgentCore Memory integration end-to-end against real AWS (Section 15). What remains is publishing the project to its source-control platform, the short one-time setup that pipeline depends on, and promotion to Staging and Production — not a redesign, but a continuation of a foundation already proven to work.</w:t>
       </w:r>
       <w:r/>
       <w:r/>
@@ -10460,6 +10757,50 @@
           <w:p>
             <w:r>
               <w:t>AWS's managed runtime for hosting production agentic systems in the cloud, used in Phase 02 to deploy this system as a real, standalone AWS service.</w:t>
+            </w:r>
+          </w:p>
+        </w:tc>
+      </w:tr>
+      <w:tr>
+        <w:tc>
+          <w:tcPr>
+            <w:tcW w:type="dxa" w:w="2196"/>
+          </w:tcPr>
+          <w:p>
+            <w:r>
+              <w:t>AgentCore Gateway</w:t>
+            </w:r>
+          </w:p>
+        </w:tc>
+        <w:tc>
+          <w:tcPr>
+            <w:tcW w:type="dxa" w:w="6660"/>
+          </w:tcPr>
+          <w:p>
+            <w:r>
+              <w:t>The AWS service used in Phase 04 to expose the system's data-retrieval tools through a single, centrally governed, authenticated access point, reusable by other systems or agents.</w:t>
+            </w:r>
+          </w:p>
+        </w:tc>
+      </w:tr>
+      <w:tr>
+        <w:tc>
+          <w:tcPr>
+            <w:tcW w:type="dxa" w:w="2196"/>
+          </w:tcPr>
+          <w:p>
+            <w:r>
+              <w:t>AgentCore Memory</w:t>
+            </w:r>
+          </w:p>
+        </w:tc>
+        <w:tc>
+          <w:tcPr>
+            <w:tcW w:type="dxa" w:w="6660"/>
+          </w:tcPr>
+          <w:p>
+            <w:r>
+              <w:t>The AWS service used in Phase 04 to retain a client's earlier questions within a conversation and make that context available to the system when answering a related, later question.</w:t>
             </w:r>
           </w:p>
         </w:tc>

</xml_diff>

<commit_message>
feat: implement AgentCore Policy (Cedar authorization), currently blocked by a real AWS issue
Adds a Cedar-based authorization layer (WS10) on top of the AgentCore
Gateway from WS8: a new agentcore-policy Terraform module (policy engine +
per-tool allow-list/input-validation policies), gateway/IAM wiring across
all three environments, and a GatewayPolicyDenialHookProvider so a denial
is reported honestly instead of fabricated or leaked to the client.

Terraform applies cleanly and was live-verified end to end, but attaching
the policy engine to the Gateway - even in log-only mode - makes every
tool call fail with a generic AWS-side InternalServerException, reproduced
consistently and confirmed not caller-identity-related. Policy stays
switched off (enable_policy=false) in dev pending resolution.

Also updates Execution-05.md, architecture.md, ci_cd_runbook.md, the
project report docx, and the Phase 04 deck to document the capability and
its known blocker.
</commit_message>
<xml_diff>
--- a/docs/AMC_RFP_Orchestrator_Project_Report.docx
+++ b/docs/AMC_RFP_Orchestrator_Project_Report.docx
@@ -175,7 +175,7 @@
               <w:rPr>
                 <w:sz w:val="21"/>
               </w:rPr>
-              <w:t>Phase 01 (Development), Phase 02 (Cloud Deployment), Phase 03 (CI/CD Automation) &amp; Phase 04 (Gateway-Routed Tools &amp; AgentCore Memory)</w:t>
+              <w:t>Phase 01 (Development), Phase 02 (Cloud Deployment), Phase 03 (CI/CD Automation) &amp; Phase 04 (Gateway-Routed Tools, AgentCore Memory &amp; Policy)</w:t>
             </w:r>
           </w:p>
         </w:tc>
@@ -207,7 +207,7 @@
               <w:rPr>
                 <w:sz w:val="21"/>
               </w:rPr>
-              <w:t>Phase 01 complete; Phases 02–04 all proven end-to-end on real AWS for the Development environment; Staging/Production rollout pending</w:t>
+              <w:t>Phase 01 complete; Phases 02–03 and most of Phase 04 proven end-to-end on real AWS for the Development environment (AgentCore Policy implemented but currently blocked by a real AWS-side issue — Section 15.11); Staging/Production rollout pending</w:t>
             </w:r>
           </w:p>
         </w:tc>
@@ -8782,6 +8782,14 @@
         <w:pStyle w:val="ListBullet"/>
       </w:pPr>
       <w:r>
+        <w:t>AgentCore Policy (Section 15.9) is implemented and applies cleanly to real AWS, but is currently blocked by a real platform-side issue that makes every tool call fail once the policy engine is attached — even in its safest, log-only mode. The two concrete next steps are trying the alternative enforcement mode as a lower-cost diagnostic, and opening a support case with AWS if that does not resolve it; the feature remains switched off in the Development environment until then.</w:t>
+      </w:r>
+    </w:p>
+    <w:p>
+      <w:pPr>
+        <w:pStyle w:val="ListBullet"/>
+      </w:pPr>
+      <w:r>
         <w:t>Gateway-routed tool logic and AgentCore Memory are now implemented and live-verified end-to-end against real AWS (Section 15); the remaining step is carrying both through Staging and Production once each environment has its first deployment, and adding the Memory round-trip to the project’s automated integration-test suite alongside the manual verification already performed.</w:t>
       </w:r>
     </w:p>
@@ -8819,6 +8827,20 @@
       <w:pPr/>
       <w:r>
         <w:t>The previously deferred Gateway-routed tool logic and AgentCore Memory integration (Section 13.8) have been implemented and live-verified end-to-end against real AWS — see Section 15 for the full account, including engineering decisions, issues found and fixed during live deployment, and live verification results for both capabilities.</w:t>
+      </w:r>
+    </w:p>
+    <w:p>
+      <w:pPr>
+        <w:pStyle w:val="Heading2"/>
+      </w:pPr>
+      <w:r>
+        <w:t>12.7 Phase 04 (AgentCore Policy) — Built, Blocked by a Real AWS Issue</w:t>
+      </w:r>
+    </w:p>
+    <w:p>
+      <w:pPr/>
+      <w:r>
+        <w:t>AgentCore Policy — Cedar-based authorization for the Gateway's two tools — has been implemented and its infrastructure applies cleanly to real AWS, but attaching it to the Gateway currently makes every tool call fail with a generic platform-side error, reproduced consistently and confirmed not to be a configuration mistake on this project's side (Section 15.11). The capability remains switched off in the Development environment until this is resolved, so as not to disrupt the already-working Gateway-routed tools and Memory capabilities described above.</w:t>
       </w:r>
     </w:p>
     <w:p>
@@ -10007,13 +10029,13 @@
         <w:pStyle w:val="Heading1"/>
       </w:pPr>
       <w:r>
-        <w:t>15. Phase 04: Gateway-Routed Tools &amp; AgentCore Memory</w:t>
+        <w:t>15. Phase 04: Gateway-Routed Tools, AgentCore Memory &amp; Policy</w:t>
       </w:r>
     </w:p>
     <w:p>
       <w:pPr/>
       <w:r>
-        <w:t>Phase 02 provisioned two AWS capabilities that were deliberately left unused at the time — a governed, centrally managed way to expose the system’s data-retrieval tools (AgentCore Gateway), and a managed service for retaining conversation history across a client’s questions (AgentCore Memory) — flagged in Section 13.8 as a separate, larger follow-on rather than bundled into that phase. Phase 04 completes that follow-on: real tool logic behind the Gateway, and a working read/write integration with AgentCore Memory for cross-turn conversational context, both implemented and live-verified end-to-end against real AWS.</w:t>
+        <w:t>Phase 02 provisioned two AWS capabilities that were deliberately left unused at the time — a governed, centrally managed way to expose the system’s data-retrieval tools (AgentCore Gateway), and a managed service for retaining conversation history across a client’s questions (AgentCore Memory) — flagged in Section 13.8 as a separate, larger follow-on rather than bundled into that phase. Phase 04 completes that follow-on: real tool logic behind the Gateway, and a working read/write integration with AgentCore Memory for cross-turn conversational context, both implemented and live-verified end-to-end against real AWS. This phase also adds a third, related capability on top of the same Gateway — AgentCore Policy, a rules-based authorization layer for tool access — which is implemented and applies cleanly to AWS but is not yet live, blocked by a real platform-side issue described in full in Section 15.11.</w:t>
       </w:r>
     </w:p>
     <w:p>
@@ -10276,6 +10298,164 @@
       </w:pPr>
       <w:r>
         <w:t>The conversational-memory round-trip has so far been verified through a targeted, one-off verification exercise rather than the project’s automated, repeatable test suite used elsewhere (Section 7.5) — adding equivalent automated coverage is a recommended near-term addition.</w:t>
+      </w:r>
+    </w:p>
+    <w:p>
+      <w:pPr>
+        <w:pStyle w:val="Heading2"/>
+      </w:pPr>
+      <w:r>
+        <w:t>15.9 AgentCore Policy</w:t>
+      </w:r>
+    </w:p>
+    <w:p>
+      <w:pPr/>
+      <w:r>
+        <w:t>AgentCore Policy adds a further, optional layer of control on top of the Gateway described in Section 15.2: a rules-based authorization check that runs before a tool call is allowed through, independent of and in addition to the tool logic itself. Rather than only controlling whether a tool call reaches the Gateway at all, Policy controls what happens once it arrives — which specific tools may be called, and under what conditions.</w:t>
+      </w:r>
+    </w:p>
+    <w:p>
+      <w:pPr>
+        <w:pStyle w:val="ListBullet"/>
+      </w:pPr>
+      <w:r>
+        <w:t>Tool-level allow-listing. Each of the system's two real tools is explicitly permitted by name; anything not explicitly permitted is denied by default, so a future third tool added to the Gateway is blocked until a rule exists for it, rather than silently exposed.</w:t>
+      </w:r>
+    </w:p>
+    <w:p>
+      <w:pPr>
+        <w:pStyle w:val="ListBullet"/>
+      </w:pPr>
+      <w:r>
+        <w:t>Input validation as a governance rule, not just application logic. Both existing tools now also require their one input parameter to be genuinely provided, enforced at the authorization layer itself rather than relying solely on the application code to check it.</w:t>
+      </w:r>
+    </w:p>
+    <w:p>
+      <w:pPr>
+        <w:pStyle w:val="ListBullet"/>
+      </w:pPr>
+      <w:r>
+        <w:t>Two operating modes. A safe, observe-only mode logs every authorization decision without blocking anything, intended as the first step of any rollout; a second, enforcing mode is switched on only after the observe-only mode has been verified — see Section 15.11 for why this project has not yet completed that verification.</w:t>
+      </w:r>
+    </w:p>
+    <w:p>
+      <w:pPr>
+        <w:pStyle w:val="Heading2"/>
+      </w:pPr>
+      <w:r>
+        <w:t>15.10 Key Engineering Decisions</w:t>
+      </w:r>
+    </w:p>
+    <w:p>
+      <w:pPr/>
+      <w:r>
+        <w:t>Three decisions were made deliberately during implementation, each confirmed by direct testing against real AWS rather than assumed from documentation:</w:t>
+      </w:r>
+    </w:p>
+    <w:p>
+      <w:pPr>
+        <w:pStyle w:val="ListBullet"/>
+      </w:pPr>
+      <w:r>
+        <w:t>Authorization rules are written directly as version-controlled infrastructure, not generated ad hoc. AWS offers a natural-language-to-rule generation aid intended for interactive authoring; this project instead hand-authors the equivalent rules directly in the same infrastructure-as-code system as everything else, so every authorization rule is reviewable, versioned, and reproducible the same way the rest of the AWS footprint already is.</w:t>
+      </w:r>
+    </w:p>
+    <w:p>
+      <w:pPr>
+        <w:pStyle w:val="ListBullet"/>
+      </w:pPr>
+      <w:r>
+        <w:t>A circular configuration dependency was caught before it ever reached real AWS. The Gateway's own permission to evaluate authorization rules needs to exist before Policy is attached to it, but an early design would have made that permission depend on the Gateway's own identifier while the Gateway attachment depended on that same permission — a genuine circular requirement, caught by the infrastructure tooling's own validation step rather than discovered live. Resolved by broadening that one specific permission slightly rather than trying to force a circular dependency to resolve itself.</w:t>
+      </w:r>
+    </w:p>
+    <w:p>
+      <w:pPr>
+        <w:pStyle w:val="ListBullet"/>
+      </w:pPr>
+      <w:r>
+        <w:t>AWS itself modifies Gateway configuration as a side effect of attaching Policy — a behaviour undocumented anywhere consulted while designing this — adding a specific tracking header to each tool's configuration automatically. The infrastructure definition was updated to deliberately leave that specific, AWS-managed setting alone rather than have every future update try to remove something AWS itself put there, and this project's own tooling was also found, by testing, to actively refuse letting this project set that value manually — confirming it is intentionally AWS-managed, not an oversight.</w:t>
+      </w:r>
+    </w:p>
+    <w:p>
+      <w:pPr>
+        <w:pStyle w:val="Heading2"/>
+      </w:pPr>
+      <w:r>
+        <w:t>15.11 Known Blocker — Not Yet Live on Real AWS</w:t>
+      </w:r>
+    </w:p>
+    <w:p>
+      <w:pPr/>
+      <w:r>
+        <w:t>Unlike Gateway-routed tools and AgentCore Memory (Section 15.6), AgentCore Policy has not been successfully live-verified, despite genuine, repeated attempts against real AWS. With the authorization rules correctly and verifiably in place — confirmed directly, not assumed — attaching them to the Gateway, even in the safe, observe-only mode described in Section 15.9, causes every tool call to fail with a generic platform-side error. This occurred consistently, including for requests that the authorization rules explicitly permit, and including in the specific mode AWS's own documentation states should never block a request.</w:t>
+      </w:r>
+    </w:p>
+    <w:p>
+      <w:pPr>
+        <w:pStyle w:val="ListBullet"/>
+      </w:pPr>
+      <w:r>
+        <w:t>Confirmed specific to this capability, not a broader regression. The identical request succeeds immediately, with correct data returned, the moment the authorization layer is detached — and fails again, identically, the moment it is reattached.</w:t>
+      </w:r>
+    </w:p>
+    <w:p>
+      <w:pPr>
+        <w:pStyle w:val="ListBullet"/>
+      </w:pPr>
+      <w:r>
+        <w:t>Confirmed not a caller-identity issue. One early theory was that the specific type of AWS identity used for testing was the cause; this was ruled out by reproducing the exact same failure through the actual deployed system's own real identity, not just a developer's own credentials.</w:t>
+      </w:r>
+    </w:p>
+    <w:p>
+      <w:pPr>
+        <w:pStyle w:val="ListBullet"/>
+      </w:pPr>
+      <w:r>
+        <w:t>No further diagnostic detail available from AWS's own monitoring for this specific investigation — a separate, already-known monitoring gap (Section 12.4) meant neither the relevant log data nor distributed-tracing data was available to narrow the cause further.</w:t>
+      </w:r>
+    </w:p>
+    <w:p>
+      <w:pPr/>
+      <w:r>
+        <w:t>Given the risk of leaving a real, previously working capability broken, AgentCore Policy has been deliberately switched back off in the Development environment while this is investigated further, restoring the Gateway-routed tools and Memory capabilities to their prior, fully working state. The underlying implementation — the infrastructure, the permissions, and the safe-failure handling described in Section 15.10 — is believed correct and ready to re-enable once this is resolved. The two concrete next steps are: attempting the enforcing mode described in Section 15.9 as a lower-cost diagnostic, since it is a materially different code path on AWS's side that may not share this issue; and, if that does not resolve it, opening a support case directly with AWS.</w:t>
+      </w:r>
+    </w:p>
+    <w:p>
+      <w:pPr>
+        <w:pStyle w:val="Heading2"/>
+      </w:pPr>
+      <w:r>
+        <w:t>15.12 Current Status and Remaining Work</w:t>
+      </w:r>
+    </w:p>
+    <w:p>
+      <w:pPr/>
+      <w:r>
+        <w:t>As of this report, AgentCore Policy stands as follows:</w:t>
+      </w:r>
+    </w:p>
+    <w:p>
+      <w:pPr>
+        <w:pStyle w:val="ListBullet"/>
+      </w:pPr>
+      <w:r>
+        <w:t>Implementation is complete and the infrastructure applies cleanly and repeatably to real AWS — confirmed via a clean, zero-difference check after every change.</w:t>
+      </w:r>
+    </w:p>
+    <w:p>
+      <w:pPr>
+        <w:pStyle w:val="ListBullet"/>
+      </w:pPr>
+      <w:r>
+        <w:t>The capability is not yet usable due to the platform-side issue described in Section 15.11, and remains switched off by default and currently disabled in the Development environment as a result.</w:t>
+      </w:r>
+    </w:p>
+    <w:p>
+      <w:pPr>
+        <w:pStyle w:val="ListBullet"/>
+      </w:pPr>
+      <w:r>
+        <w:t>No business value from this specific capability can be claimed until it is confirmed working end-to-end against real AWS — consistent with this project's practice of only reporting a capability as delivered once it has been proven live, not merely built.</w:t>
       </w:r>
     </w:p>
     <w:p>
@@ -10292,7 +10472,7 @@
     </w:p>
     <w:p>
       <w:r>
-        <w:t>The AMC RFP &amp; Portfolio Insight Orchestrator demonstrates that agentic AI, applied with the same discipline as any other production financial-services system, can automate one of an AMC’s most labour-intensive and compliance-sensitive workflows without compromising on governance. By decomposing the work across specialised agents, grounding every figure in real data, and making compliance a structural, self-correcting property of the workflow rather than a manual checklist, the system delivers response times measured in seconds instead of days, while producing a stronger, more consistent, and more auditable compliance trail than the manual process it replaces. Built on AWS’s Strands Agents framework and designed from day one for a clean path to AWS Bedrock in production, this system has since been proven not only in local development but as a real, deployed AWS service: Phase 02 stood up the full Amazon Bedrock AgentCore infrastructure and live-verified every mock fund scenario end-to-end in the cloud, with zero changes to the underlying agent logic, and Phase 03 codified the build-and-deploy process itself into an automated, auditable pipeline that requires no long-lived cloud credentials. Phase 04 has since implemented and live-verified the previously deferred Gateway-routed tool logic and AgentCore Memory integration end-to-end against real AWS (Section 15). What remains is publishing the project to its source-control platform, the short one-time setup that pipeline depends on, and promotion to Staging and Production — not a redesign, but a continuation of a foundation already proven to work.</w:t>
+        <w:t>The AMC RFP &amp; Portfolio Insight Orchestrator demonstrates that agentic AI, applied with the same discipline as any other production financial-services system, can automate one of an AMC’s most labour-intensive and compliance-sensitive workflows without compromising on governance. By decomposing the work across specialised agents, grounding every figure in real data, and making compliance a structural, self-correcting property of the workflow rather than a manual checklist, the system delivers response times measured in seconds instead of days, while producing a stronger, more consistent, and more auditable compliance trail than the manual process it replaces. Built on AWS’s Strands Agents framework and designed from day one for a clean path to AWS Bedrock in production, this system has since been proven not only in local development but as a real, deployed AWS service: Phase 02 stood up the full Amazon Bedrock AgentCore infrastructure and live-verified every mock fund scenario end-to-end in the cloud, with zero changes to the underlying agent logic, and Phase 03 codified the build-and-deploy process itself into an automated, auditable pipeline that requires no long-lived cloud credentials. Phase 04 has since implemented and live-verified the previously deferred Gateway-routed tool logic and AgentCore Memory integration end-to-end against real AWS (Section 15), and has also built a further authorization layer, AgentCore Policy, on top of the same Gateway — implemented and cleanly deployable, though not yet usable pending resolution of a real platform-side issue found during live testing (Section 15.11). What remains is publishing the project to its source-control platform, the short one-time setup that pipeline depends on, promotion to Staging and Production, and resolving the one open AgentCore Policy blocker — not a redesign, but a continuation of a foundation already proven to work.</w:t>
       </w:r>
       <w:r/>
       <w:r/>
@@ -10801,6 +10981,50 @@
           <w:p>
             <w:r>
               <w:t>The AWS service used in Phase 04 to retain a client's earlier questions within a conversation and make that context available to the system when answering a related, later question.</w:t>
+            </w:r>
+          </w:p>
+        </w:tc>
+      </w:tr>
+      <w:tr>
+        <w:tc>
+          <w:tcPr>
+            <w:tcW w:type="dxa" w:w="2196"/>
+          </w:tcPr>
+          <w:p>
+            <w:r>
+              <w:t>AgentCore Policy</w:t>
+            </w:r>
+          </w:p>
+        </w:tc>
+        <w:tc>
+          <w:tcPr>
+            <w:tcW w:type="dxa" w:w="6660"/>
+          </w:tcPr>
+          <w:p>
+            <w:r>
+              <w:t>The AWS service used in Phase 04 to add rules-based authorization on top of the Gateway — controlling which tools may be called and under what conditions, independent of the tool logic itself.</w:t>
+            </w:r>
+          </w:p>
+        </w:tc>
+      </w:tr>
+      <w:tr>
+        <w:tc>
+          <w:tcPr>
+            <w:tcW w:type="dxa" w:w="2196"/>
+          </w:tcPr>
+          <w:p>
+            <w:r>
+              <w:t>Cedar</w:t>
+            </w:r>
+          </w:p>
+        </w:tc>
+        <w:tc>
+          <w:tcPr>
+            <w:tcW w:type="dxa" w:w="6660"/>
+          </w:tcPr>
+          <w:p>
+            <w:r>
+              <w:t>The rule-authoring language AgentCore Policy uses to express authorization rules, in a specific, checkable format rather than free text.</w:t>
             </w:r>
           </w:p>
         </w:tc>

</xml_diff>